<commit_message>
chore: limpiar carpeta docs — eliminar temporales y screenshots
</commit_message>
<xml_diff>
--- a/docs/INFORME_REALIZACION_BOLETINES_2026.docx
+++ b/docs/INFORME_REALIZACION_BOLETINES_2026.docx
@@ -4,19 +4,393 @@
   <w:body>
     <w:p>
       <w:pPr>
-        <w:jc w:val="center"/>
         <w:rPr>
+          <w:rFonts w:ascii="Cambria" w:hAnsi="Cambria"/>
+          <w:color w:val="000000"/>
+          <w:lang w:val="pt-PT"/>
+        </w:rPr>
+      </w:pPr>
+      <w:r>
+        <w:rPr>
+          <w:rFonts w:ascii="Cambria" w:hAnsi="Cambria"/>
+          <w:color w:val="000000"/>
+          <w:lang w:val="pt-PT"/>
+        </w:rPr>
+        <w:t xml:space="preserve">Oficio Nro. </w:t>
+      </w:r>
+      <w:r>
+        <w:rPr>
+          <w:rFonts w:ascii="Cambria" w:hAnsi="Cambria"/>
+          <w:color w:val="000000"/>
+          <w:lang w:val="pt-PT"/>
+        </w:rPr>
+        <w:t>Adrz-</w:t>
+      </w:r>
+      <w:r>
+        <w:rPr>
+          <w:rFonts w:ascii="Cambria" w:hAnsi="Cambria"/>
+          <w:color w:val="000000"/>
+          <w:lang w:val="pt-PT"/>
+        </w:rPr>
+        <w:t>2026</w:t>
+      </w:r>
+      <w:r>
+        <w:rPr>
+          <w:rFonts w:ascii="Cambria" w:hAnsi="Cambria"/>
+          <w:color w:val="000000"/>
+          <w:lang w:val="pt-PT"/>
+        </w:rPr>
+        <w:t>-08-14</w:t>
+      </w:r>
+    </w:p>
+    <w:p>
+      <w:pPr>
+        <w:rPr>
+          <w:rFonts w:ascii="Cambria" w:hAnsi="Cambria"/>
+          <w:color w:val="000000"/>
+          <w:lang w:val="pt-PT"/>
+        </w:rPr>
+      </w:pPr>
+    </w:p>
+    <w:p>
+      <w:pPr>
+        <w:rPr>
+          <w:rFonts w:ascii="Cambria" w:hAnsi="Cambria"/>
+          <w:color w:val="000000"/>
+          <w:lang w:val="pt-PT"/>
+        </w:rPr>
+      </w:pPr>
+      <w:r>
+        <w:rPr>
+          <w:rFonts w:ascii="Cambria" w:hAnsi="Cambria"/>
+          <w:color w:val="000000"/>
+          <w:lang w:val="pt-PT"/>
+        </w:rPr>
+        <w:t>Manta, 14 de agosto de 2026</w:t>
+      </w:r>
+    </w:p>
+    <w:p>
+      <w:pPr>
+        <w:rPr>
+          <w:rFonts w:ascii="Cambria" w:hAnsi="Cambria"/>
+          <w:color w:val="000000"/>
+          <w:lang w:val="pt-PT"/>
+        </w:rPr>
+      </w:pPr>
+    </w:p>
+    <w:p>
+      <w:pPr>
+        <w:spacing w:after="0"/>
+        <w:rPr>
+          <w:rFonts w:ascii="Cambria" w:hAnsi="Cambria"/>
+          <w:color w:val="000000"/>
           <w:lang w:val="es-EC"/>
         </w:rPr>
       </w:pPr>
       <w:r>
         <w:rPr>
-          <w:b/>
-          <w:color w:val="003366"/>
-          <w:sz w:val="48"/>
+          <w:rFonts w:ascii="Cambria" w:hAnsi="Cambria"/>
+          <w:color w:val="000000"/>
           <w:lang w:val="es-EC"/>
         </w:rPr>
-        <w:t xml:space="preserve">INFORME DE </w:t>
+        <w:t>Doctor</w:t>
+      </w:r>
+    </w:p>
+    <w:p>
+      <w:pPr>
+        <w:spacing w:after="0"/>
+        <w:rPr>
+          <w:rFonts w:ascii="Cambria" w:hAnsi="Cambria"/>
+          <w:color w:val="000000"/>
+          <w:lang w:val="es-EC"/>
+        </w:rPr>
+      </w:pPr>
+      <w:r>
+        <w:rPr>
+          <w:rFonts w:ascii="Cambria" w:hAnsi="Cambria"/>
+          <w:color w:val="000000"/>
+          <w:lang w:val="es-EC"/>
+        </w:rPr>
+        <w:t>Germán Carrera, PhD.</w:t>
+      </w:r>
+    </w:p>
+    <w:p>
+      <w:pPr>
+        <w:spacing w:after="0"/>
+        <w:rPr>
+          <w:rFonts w:ascii="Cambria" w:hAnsi="Cambria"/>
+          <w:color w:val="000000"/>
+          <w:lang w:val="es-EC"/>
+        </w:rPr>
+      </w:pPr>
+      <w:r>
+        <w:rPr>
+          <w:rFonts w:ascii="Cambria" w:hAnsi="Cambria"/>
+          <w:color w:val="000000"/>
+          <w:lang w:val="es-EC"/>
+        </w:rPr>
+        <w:t>Coordinador de la Carrera de Pedagogía de los Idiomas Nacionales y Extranjeros</w:t>
+      </w:r>
+    </w:p>
+    <w:p>
+      <w:pPr>
+        <w:spacing w:after="0"/>
+        <w:rPr>
+          <w:rFonts w:ascii="Cambria" w:hAnsi="Cambria"/>
+          <w:color w:val="000000"/>
+          <w:lang w:val="es-EC"/>
+        </w:rPr>
+      </w:pPr>
+      <w:r>
+        <w:rPr>
+          <w:rFonts w:ascii="Cambria" w:hAnsi="Cambria"/>
+          <w:color w:val="000000"/>
+          <w:lang w:val="es-EC"/>
+        </w:rPr>
+        <w:t>Universidad Laica Eloy Alfaro de Manabí</w:t>
+      </w:r>
+    </w:p>
+    <w:p>
+      <w:pPr>
+        <w:rPr>
+          <w:rFonts w:ascii="Cambria" w:hAnsi="Cambria"/>
+          <w:color w:val="000000"/>
+          <w:lang w:val="es-EC"/>
+        </w:rPr>
+      </w:pPr>
+      <w:proofErr w:type="gramStart"/>
+      <w:r>
+        <w:rPr>
+          <w:rFonts w:ascii="Cambria" w:hAnsi="Cambria"/>
+          <w:color w:val="000000"/>
+          <w:lang w:val="es-EC"/>
+        </w:rPr>
+        <w:t>Ciudad.-</w:t>
+      </w:r>
+      <w:proofErr w:type="gramEnd"/>
+    </w:p>
+    <w:p>
+      <w:pPr>
+        <w:jc w:val="both"/>
+        <w:rPr>
+          <w:rFonts w:ascii="Cambria" w:hAnsi="Cambria"/>
+          <w:color w:val="000000"/>
+          <w:lang w:val="es-EC"/>
+        </w:rPr>
+      </w:pPr>
+    </w:p>
+    <w:p>
+      <w:pPr>
+        <w:jc w:val="both"/>
+        <w:rPr>
+          <w:rFonts w:ascii="Cambria" w:hAnsi="Cambria"/>
+          <w:color w:val="000000"/>
+          <w:lang w:val="es-EC"/>
+        </w:rPr>
+      </w:pPr>
+      <w:r>
+        <w:rPr>
+          <w:rFonts w:ascii="Cambria" w:hAnsi="Cambria"/>
+          <w:color w:val="000000"/>
+          <w:lang w:val="es-EC"/>
+        </w:rPr>
+        <w:t>De mi consideración</w:t>
+      </w:r>
+    </w:p>
+    <w:p>
+      <w:pPr>
+        <w:jc w:val="both"/>
+        <w:rPr>
+          <w:rFonts w:ascii="Cambria" w:hAnsi="Cambria"/>
+          <w:color w:val="000000"/>
+          <w:lang w:val="es-EC"/>
+        </w:rPr>
+      </w:pPr>
+    </w:p>
+    <w:p>
+      <w:pPr>
+        <w:jc w:val="both"/>
+        <w:rPr>
+          <w:rFonts w:ascii="Cambria" w:hAnsi="Cambria"/>
+          <w:color w:val="000000"/>
+          <w:lang w:val="es-EC"/>
+        </w:rPr>
+      </w:pPr>
+      <w:r>
+        <w:rPr>
+          <w:rFonts w:ascii="Cambria" w:hAnsi="Cambria"/>
+          <w:color w:val="000000"/>
+          <w:lang w:val="es-EC"/>
+        </w:rPr>
+        <w:t>Por medio del presente pongo en su conocimiento el informe de ejecución de los boletines bimensuales de la carrera, elaborado dentro del proyecto de Innovaciones Pedagógicas e Internacionalización. El propósito de este documento es dejar constancia de que la estrategia de difusión aprobada para la carrera ya está en funcionamiento y de que sus contenidos se publican de forma periódica y con acceso abierto al público.</w:t>
+      </w:r>
+    </w:p>
+    <w:p>
+      <w:pPr>
+        <w:jc w:val="both"/>
+        <w:rPr>
+          <w:rFonts w:ascii="Cambria" w:hAnsi="Cambria"/>
+          <w:color w:val="000000"/>
+          <w:lang w:val="es-EC"/>
+        </w:rPr>
+      </w:pPr>
+      <w:r>
+        <w:rPr>
+          <w:rFonts w:ascii="Cambria" w:hAnsi="Cambria"/>
+          <w:color w:val="000000"/>
+          <w:lang w:val="es-EC"/>
+        </w:rPr>
+        <w:t>El informe explica en qué consiste el sistema de boletines, cómo se accede a ellos desde la página web de la carrera y qué se ha publicado durante los bimestres III y IV de 2026. En ese período se difundieron once contenidos entre noticias y actividades académicas, que quedan documentados como evidencia del trabajo de docencia innovadora de la carrera. También se describe la manera en que el sistema incorpora cada nueva noticia o actividad de forma automática, sin necesidad de tareas técnicas adicionales.</w:t>
+      </w:r>
+    </w:p>
+    <w:p>
+      <w:pPr>
+        <w:jc w:val="both"/>
+        <w:rPr>
+          <w:rFonts w:ascii="Cambria" w:hAnsi="Cambria"/>
+          <w:color w:val="000000"/>
+          <w:lang w:val="es-EC"/>
+        </w:rPr>
+      </w:pPr>
+    </w:p>
+    <w:p>
+      <w:pPr>
+        <w:jc w:val="both"/>
+        <w:rPr>
+          <w:rFonts w:ascii="Cambria" w:hAnsi="Cambria"/>
+          <w:color w:val="000000"/>
+          <w:lang w:val="es-EC"/>
+        </w:rPr>
+      </w:pPr>
+      <w:r>
+        <w:rPr>
+          <w:rFonts w:ascii="Cambria" w:hAnsi="Cambria"/>
+          <w:color w:val="000000"/>
+          <w:lang w:val="es-EC"/>
+        </w:rPr>
+        <w:t>Pongo este informe a su consideración para su revisión y los fines que estime pertinentes. Agradezco de antemano la atención brindada.</w:t>
+      </w:r>
+    </w:p>
+    <w:p>
+      <w:pPr>
+        <w:spacing w:after="0"/>
+        <w:rPr>
+          <w:rFonts w:ascii="Cambria" w:hAnsi="Cambria"/>
+          <w:color w:val="000000"/>
+          <w:lang w:val="es-EC"/>
+        </w:rPr>
+      </w:pPr>
+    </w:p>
+    <w:p>
+      <w:pPr>
+        <w:spacing w:after="0"/>
+        <w:rPr>
+          <w:rFonts w:ascii="Cambria" w:hAnsi="Cambria"/>
+          <w:color w:val="000000"/>
+          <w:lang w:val="es-EC"/>
+        </w:rPr>
+      </w:pPr>
+      <w:r>
+        <w:rPr>
+          <w:rFonts w:ascii="Cambria" w:hAnsi="Cambria"/>
+          <w:color w:val="000000"/>
+          <w:lang w:val="es-EC"/>
+        </w:rPr>
+        <w:t>Atentamente,</w:t>
+      </w:r>
+    </w:p>
+    <w:p>
+      <w:pPr>
+        <w:spacing w:after="0"/>
+        <w:rPr>
+          <w:rFonts w:ascii="Cambria" w:hAnsi="Cambria"/>
+          <w:color w:val="000000"/>
+          <w:lang w:val="es-EC"/>
+        </w:rPr>
+      </w:pPr>
+    </w:p>
+    <w:p>
+      <w:pPr>
+        <w:spacing w:after="0"/>
+        <w:rPr>
+          <w:rFonts w:ascii="Cambria" w:hAnsi="Cambria"/>
+          <w:color w:val="000000"/>
+          <w:lang w:val="es-EC"/>
+        </w:rPr>
+      </w:pPr>
+    </w:p>
+    <w:p>
+      <w:pPr>
+        <w:spacing w:after="0"/>
+        <w:rPr>
+          <w:rFonts w:ascii="Cambria" w:hAnsi="Cambria"/>
+          <w:color w:val="000000"/>
+          <w:lang w:val="es-EC"/>
+        </w:rPr>
+      </w:pPr>
+    </w:p>
+    <w:p>
+      <w:pPr>
+        <w:spacing w:after="0"/>
+        <w:rPr>
+          <w:rFonts w:ascii="Cambria" w:hAnsi="Cambria"/>
+          <w:color w:val="000000"/>
+          <w:lang w:val="es-EC"/>
+        </w:rPr>
+      </w:pPr>
+    </w:p>
+    <w:p>
+      <w:pPr>
+        <w:spacing w:after="0"/>
+        <w:rPr>
+          <w:rFonts w:ascii="Cambria" w:hAnsi="Cambria"/>
+          <w:color w:val="000000"/>
+          <w:lang w:val="es-EC"/>
+        </w:rPr>
+      </w:pPr>
+      <w:r>
+        <w:rPr>
+          <w:rFonts w:ascii="Cambria" w:hAnsi="Cambria"/>
+          <w:color w:val="000000"/>
+          <w:lang w:val="es-EC"/>
+        </w:rPr>
+        <w:t>Dr. Arturo Rodríguez Zambrano</w:t>
+      </w:r>
+    </w:p>
+    <w:p>
+      <w:pPr>
+        <w:spacing w:after="0"/>
+        <w:rPr>
+          <w:rFonts w:ascii="Cambria" w:hAnsi="Cambria"/>
+          <w:color w:val="000000"/>
+          <w:lang w:val="es-EC"/>
+        </w:rPr>
+      </w:pPr>
+      <w:r>
+        <w:rPr>
+          <w:rFonts w:ascii="Cambria" w:hAnsi="Cambria"/>
+          <w:color w:val="000000"/>
+          <w:lang w:val="es-EC"/>
+        </w:rPr>
+        <w:t>Líder del Proyecto</w:t>
+      </w:r>
+    </w:p>
+    <w:p>
+      <w:pPr>
+        <w:spacing w:after="0"/>
+        <w:rPr>
+          <w:rFonts w:ascii="Cambria" w:hAnsi="Cambria"/>
+          <w:color w:val="000000"/>
+          <w:lang w:val="es-EC"/>
+        </w:rPr>
+      </w:pPr>
+      <w:r>
+        <w:rPr>
+          <w:rFonts w:ascii="Cambria" w:hAnsi="Cambria"/>
+          <w:color w:val="000000"/>
+          <w:lang w:val="es-EC"/>
+        </w:rPr>
+        <w:t>Innovaciones Pedagógicas e Internacionalización</w:t>
       </w:r>
       <w:r>
         <w:rPr>
@@ -25,23 +399,37 @@
           <w:sz w:val="48"/>
           <w:lang w:val="es-EC"/>
         </w:rPr>
-        <w:t>EJECUCIÓN</w:t>
+        <w:br w:type="page"/>
       </w:r>
     </w:p>
     <w:p>
       <w:pPr>
         <w:jc w:val="center"/>
         <w:rPr>
+          <w:b/>
+          <w:color w:val="003366"/>
+          <w:sz w:val="48"/>
           <w:lang w:val="es-EC"/>
         </w:rPr>
       </w:pPr>
       <w:r>
         <w:rPr>
           <w:b/>
-          <w:sz w:val="32"/>
+          <w:color w:val="003366"/>
+          <w:sz w:val="48"/>
           <w:lang w:val="es-EC"/>
         </w:rPr>
-        <w:t>Boletines Bimensuales</w:t>
+        <w:lastRenderedPageBreak/>
+        <w:t xml:space="preserve">Boletines </w:t>
+      </w:r>
+      <w:r>
+        <w:rPr>
+          <w:b/>
+          <w:color w:val="003366"/>
+          <w:sz w:val="48"/>
+          <w:lang w:val="es-EC"/>
+        </w:rPr>
+        <w:t>PINE</w:t>
       </w:r>
     </w:p>
     <w:p>
@@ -57,7 +445,58 @@
           <w:sz w:val="24"/>
           <w:lang w:val="es-EC"/>
         </w:rPr>
-        <w:t>Carrera de Pedagogía de los Idiomas Nacionales y Extranjeros</w:t>
+        <w:t xml:space="preserve">Informe </w:t>
+      </w:r>
+      <w:r>
+        <w:rPr>
+          <w:rFonts w:ascii="Cambria" w:hAnsi="Cambria"/>
+          <w:i/>
+          <w:sz w:val="24"/>
+          <w:lang w:val="es-EC"/>
+        </w:rPr>
+        <w:t>sobr</w:t>
+      </w:r>
+      <w:r>
+        <w:rPr>
+          <w:i/>
+          <w:sz w:val="24"/>
+          <w:lang w:val="es-EC"/>
+        </w:rPr>
+        <w:t xml:space="preserve">e la </w:t>
+      </w:r>
+      <w:r>
+        <w:rPr>
+          <w:rFonts w:ascii="Cambria" w:hAnsi="Cambria"/>
+          <w:i/>
+          <w:sz w:val="24"/>
+          <w:lang w:val="es-EC"/>
+        </w:rPr>
+        <w:t>difusión</w:t>
+      </w:r>
+      <w:r>
+        <w:rPr>
+          <w:i/>
+          <w:sz w:val="24"/>
+          <w:lang w:val="es-EC"/>
+        </w:rPr>
+        <w:t xml:space="preserve"> de </w:t>
+      </w:r>
+      <w:r>
+        <w:rPr>
+          <w:rFonts w:ascii="Cambria" w:hAnsi="Cambria"/>
+          <w:i/>
+          <w:sz w:val="24"/>
+          <w:lang w:val="es-EC"/>
+        </w:rPr>
+        <w:t>la carrera mediante boletines bimensuale</w:t>
+      </w:r>
+      <w:r>
+        <w:rPr>
+          <w:i/>
+          <w:sz w:val="24"/>
+          <w:lang w:val="es-EC"/>
+        </w:rPr>
+        <w:t>s</w:t>
       </w:r>
     </w:p>
     <w:p>
@@ -82,12 +521,23 @@
             <w:tcW w:w="4320" w:type="dxa"/>
           </w:tcPr>
           <w:p>
+            <w:pPr>
+              <w:jc w:val="both"/>
+            </w:pPr>
             <w:r>
               <w:rPr>
                 <w:b/>
                 <w:color w:val="003366"/>
               </w:rPr>
-              <w:t>PROYECTO:</w:t>
+              <w:t>C</w:t>
+            </w:r>
+            <w:r>
+              <w:rPr>
+                <w:rFonts w:ascii="Cambria" w:hAnsi="Cambria"/>
+                <w:b/>
+                <w:color w:val="003366"/>
+              </w:rPr>
+              <w:t>arrera</w:t>
             </w:r>
           </w:p>
         </w:tc>
@@ -96,9 +546,32 @@
             <w:tcW w:w="4320" w:type="dxa"/>
           </w:tcPr>
           <w:p>
+            <w:pPr>
+              <w:jc w:val="both"/>
+              <w:rPr>
+                <w:lang w:val="es-EC"/>
+              </w:rPr>
+            </w:pPr>
             <w:r>
-              <w:t>Innovaciones Pedagógicas e Internacionalización</w:t>
+              <w:rPr>
+                <w:lang w:val="es-EC"/>
+              </w:rPr>
+              <w:t>Pedagogía de los Idiomas Nacionales y Extra</w:t>
             </w:r>
+            <w:r>
+              <w:rPr>
+                <w:lang w:val="es-EC"/>
+              </w:rPr>
+              <w:t xml:space="preserve">njeros: </w:t>
+            </w:r>
+            <w:proofErr w:type="gramStart"/>
+            <w:r>
+              <w:rPr>
+                <w:lang w:val="es-EC"/>
+              </w:rPr>
+              <w:t>Inglés</w:t>
+            </w:r>
+            <w:proofErr w:type="gramEnd"/>
           </w:p>
         </w:tc>
       </w:tr>
@@ -108,13 +581,26 @@
             <w:tcW w:w="4320" w:type="dxa"/>
           </w:tcPr>
           <w:p>
+            <w:pPr>
+              <w:jc w:val="both"/>
+            </w:pPr>
+            <w:proofErr w:type="spellStart"/>
             <w:r>
               <w:rPr>
                 <w:b/>
                 <w:color w:val="003366"/>
               </w:rPr>
-              <w:t>INSTITUCIÓN:</w:t>
+              <w:t>I</w:t>
             </w:r>
+            <w:r>
+              <w:rPr>
+                <w:rFonts w:ascii="Cambria" w:hAnsi="Cambria"/>
+                <w:b/>
+                <w:color w:val="003366"/>
+              </w:rPr>
+              <w:t>nstitución</w:t>
+            </w:r>
+            <w:proofErr w:type="spellEnd"/>
           </w:p>
         </w:tc>
         <w:tc>
@@ -123,6 +609,7 @@
           </w:tcPr>
           <w:p>
             <w:pPr>
+              <w:jc w:val="both"/>
               <w:rPr>
                 <w:lang w:val="es-EC"/>
               </w:rPr>
@@ -142,13 +629,26 @@
             <w:tcW w:w="4320" w:type="dxa"/>
           </w:tcPr>
           <w:p>
+            <w:pPr>
+              <w:jc w:val="both"/>
+            </w:pPr>
+            <w:proofErr w:type="spellStart"/>
             <w:r>
               <w:rPr>
                 <w:b/>
                 <w:color w:val="003366"/>
               </w:rPr>
-              <w:t>LÍDER:</w:t>
+              <w:t>L</w:t>
             </w:r>
+            <w:r>
+              <w:rPr>
+                <w:rFonts w:ascii="Cambria" w:hAnsi="Cambria"/>
+                <w:b/>
+                <w:color w:val="003366"/>
+              </w:rPr>
+              <w:t>íder</w:t>
+            </w:r>
+            <w:proofErr w:type="spellEnd"/>
           </w:p>
         </w:tc>
         <w:tc>
@@ -156,6 +656,9 @@
             <w:tcW w:w="4320" w:type="dxa"/>
           </w:tcPr>
           <w:p>
+            <w:pPr>
+              <w:jc w:val="both"/>
+            </w:pPr>
             <w:r>
               <w:t>Dr. Arturo Rodríguez Zambrano</w:t>
             </w:r>
@@ -168,13 +671,44 @@
             <w:tcW w:w="4320" w:type="dxa"/>
           </w:tcPr>
           <w:p>
+            <w:pPr>
+              <w:jc w:val="both"/>
+            </w:pPr>
+            <w:proofErr w:type="spellStart"/>
             <w:r>
               <w:rPr>
                 <w:b/>
                 <w:color w:val="003366"/>
               </w:rPr>
-              <w:t>COORDINADOR CARRERA:</w:t>
+              <w:t>C</w:t>
             </w:r>
+            <w:r>
+              <w:rPr>
+                <w:rFonts w:ascii="Cambria" w:hAnsi="Cambria"/>
+                <w:b/>
+                <w:color w:val="003366"/>
+              </w:rPr>
+              <w:t>oordinador</w:t>
+            </w:r>
+            <w:proofErr w:type="spellEnd"/>
+            <w:r>
+              <w:rPr>
+                <w:rFonts w:ascii="Cambria" w:hAnsi="Cambria"/>
+                <w:b/>
+                <w:color w:val="003366"/>
+              </w:rPr>
+              <w:t xml:space="preserve"> de </w:t>
+            </w:r>
+            <w:proofErr w:type="spellStart"/>
+            <w:r>
+              <w:rPr>
+                <w:rFonts w:ascii="Cambria" w:hAnsi="Cambria"/>
+                <w:b/>
+                <w:color w:val="003366"/>
+              </w:rPr>
+              <w:t>carrera</w:t>
+            </w:r>
+            <w:proofErr w:type="spellEnd"/>
           </w:p>
         </w:tc>
         <w:tc>
@@ -182,6 +716,9 @@
             <w:tcW w:w="4320" w:type="dxa"/>
           </w:tcPr>
           <w:p>
+            <w:pPr>
+              <w:jc w:val="both"/>
+            </w:pPr>
             <w:r>
               <w:t>Dr. Germán Carrera, PhD.</w:t>
             </w:r>
@@ -194,13 +731,44 @@
             <w:tcW w:w="4320" w:type="dxa"/>
           </w:tcPr>
           <w:p>
+            <w:pPr>
+              <w:jc w:val="both"/>
+            </w:pPr>
+            <w:proofErr w:type="spellStart"/>
             <w:r>
               <w:rPr>
                 <w:b/>
                 <w:color w:val="003366"/>
               </w:rPr>
-              <w:t>FECHA DE REPORTE:</w:t>
+              <w:t>F</w:t>
             </w:r>
+            <w:r>
+              <w:rPr>
+                <w:rFonts w:ascii="Cambria" w:hAnsi="Cambria"/>
+                <w:b/>
+                <w:color w:val="003366"/>
+              </w:rPr>
+              <w:t>echa</w:t>
+            </w:r>
+            <w:proofErr w:type="spellEnd"/>
+            <w:r>
+              <w:rPr>
+                <w:rFonts w:ascii="Cambria" w:hAnsi="Cambria"/>
+                <w:b/>
+                <w:color w:val="003366"/>
+              </w:rPr>
+              <w:t xml:space="preserve"> de </w:t>
+            </w:r>
+            <w:proofErr w:type="spellStart"/>
+            <w:r>
+              <w:rPr>
+                <w:rFonts w:ascii="Cambria" w:hAnsi="Cambria"/>
+                <w:b/>
+                <w:color w:val="003366"/>
+              </w:rPr>
+              <w:t>reporte</w:t>
+            </w:r>
+            <w:proofErr w:type="spellEnd"/>
           </w:p>
         </w:tc>
         <w:tc>
@@ -208,6 +776,9 @@
             <w:tcW w:w="4320" w:type="dxa"/>
           </w:tcPr>
           <w:p>
+            <w:pPr>
+              <w:jc w:val="both"/>
+            </w:pPr>
             <w:r>
               <w:t>14 de agosto de 2026</w:t>
             </w:r>
@@ -220,13 +791,26 @@
             <w:tcW w:w="4320" w:type="dxa"/>
           </w:tcPr>
           <w:p>
+            <w:pPr>
+              <w:jc w:val="both"/>
+            </w:pPr>
+            <w:proofErr w:type="spellStart"/>
             <w:r>
               <w:rPr>
                 <w:b/>
                 <w:color w:val="003366"/>
               </w:rPr>
-              <w:t>PERÍODO:</w:t>
+              <w:t>P</w:t>
             </w:r>
+            <w:r>
+              <w:rPr>
+                <w:rFonts w:ascii="Cambria" w:hAnsi="Cambria"/>
+                <w:b/>
+                <w:color w:val="003366"/>
+              </w:rPr>
+              <w:t>eríodo</w:t>
+            </w:r>
+            <w:proofErr w:type="spellEnd"/>
           </w:p>
         </w:tc>
         <w:tc>
@@ -235,6 +819,7 @@
           </w:tcPr>
           <w:p>
             <w:pPr>
+              <w:jc w:val="both"/>
               <w:rPr>
                 <w:lang w:val="es-EC"/>
               </w:rPr>
@@ -254,12 +839,23 @@
             <w:tcW w:w="4320" w:type="dxa"/>
           </w:tcPr>
           <w:p>
+            <w:pPr>
+              <w:jc w:val="both"/>
+            </w:pPr>
             <w:r>
               <w:rPr>
                 <w:b/>
                 <w:color w:val="003366"/>
               </w:rPr>
-              <w:t>ESTADO:</w:t>
+              <w:t>E</w:t>
+            </w:r>
+            <w:r>
+              <w:rPr>
+                <w:rFonts w:ascii="Cambria" w:hAnsi="Cambria"/>
+                <w:b/>
+                <w:color w:val="003366"/>
+              </w:rPr>
+              <w:t>stado</w:t>
             </w:r>
           </w:p>
         </w:tc>
@@ -268,17 +864,84 @@
             <w:tcW w:w="4320" w:type="dxa"/>
           </w:tcPr>
           <w:p>
+            <w:pPr>
+              <w:jc w:val="both"/>
+            </w:pPr>
             <w:r>
               <w:t>✓ OPERATIVO</w:t>
             </w:r>
           </w:p>
         </w:tc>
       </w:tr>
+      <w:tr>
+        <w:tc>
+          <w:tcPr>
+            <w:tcW w:w="4320" w:type="dxa"/>
+          </w:tcPr>
+          <w:p>
+            <w:pPr>
+              <w:jc w:val="both"/>
+              <w:rPr>
+                <w:b/>
+                <w:color w:val="003366"/>
+              </w:rPr>
+            </w:pPr>
+            <w:proofErr w:type="spellStart"/>
+            <w:r>
+              <w:rPr>
+                <w:b/>
+                <w:color w:val="003366"/>
+              </w:rPr>
+              <w:t>R</w:t>
+            </w:r>
+            <w:r>
+              <w:rPr>
+                <w:rFonts w:ascii="Cambria" w:hAnsi="Cambria"/>
+                <w:b/>
+                <w:color w:val="003366"/>
+              </w:rPr>
+              <w:t>esponsable</w:t>
+            </w:r>
+            <w:proofErr w:type="spellEnd"/>
+            <w:r>
+              <w:rPr>
+                <w:rFonts w:ascii="Cambria" w:hAnsi="Cambria"/>
+                <w:b/>
+                <w:color w:val="003366"/>
+              </w:rPr>
+              <w:t xml:space="preserve"> del </w:t>
+            </w:r>
+            <w:proofErr w:type="spellStart"/>
+            <w:r>
+              <w:rPr>
+                <w:rFonts w:ascii="Cambria" w:hAnsi="Cambria"/>
+                <w:b/>
+                <w:color w:val="003366"/>
+              </w:rPr>
+              <w:t>informe</w:t>
+            </w:r>
+            <w:proofErr w:type="spellEnd"/>
+          </w:p>
+        </w:tc>
+        <w:tc>
+          <w:tcPr>
+            <w:tcW w:w="4320" w:type="dxa"/>
+          </w:tcPr>
+          <w:p>
+            <w:pPr>
+              <w:jc w:val="both"/>
+            </w:pPr>
+            <w:r>
+              <w:t>Arturo Damián Rodríguez Zambrano</w:t>
+            </w:r>
+          </w:p>
+        </w:tc>
+      </w:tr>
     </w:tbl>
-    <w:p/>
     <w:p>
       <w:pPr>
         <w:pStyle w:val="Ttulo1"/>
+        <w:jc w:val="both"/>
       </w:pPr>
       <w:r>
         <w:rPr>
@@ -289,6 +952,7 @@
     </w:p>
     <w:p>
       <w:pPr>
+        <w:jc w:val="both"/>
         <w:rPr>
           <w:lang w:val="es-EC"/>
         </w:rPr>
@@ -303,6 +967,7 @@
     <w:p>
       <w:pPr>
         <w:pStyle w:val="Ttulo1"/>
+        <w:jc w:val="both"/>
         <w:rPr>
           <w:lang w:val="es-EC"/>
         </w:rPr>
@@ -317,6 +982,7 @@
     </w:p>
     <w:p>
       <w:pPr>
+        <w:jc w:val="both"/>
         <w:rPr>
           <w:lang w:val="es-EC"/>
         </w:rPr>
@@ -330,20 +996,76 @@
     </w:p>
     <w:p>
       <w:pPr>
+        <w:jc w:val="both"/>
         <w:rPr>
           <w:lang w:val="es-EC"/>
         </w:rPr>
       </w:pPr>
+      <w:r>
+        <w:rPr>
+          <w:rFonts w:ascii="Cambria" w:hAnsi="Cambria"/>
+          <w:lang w:val="es-EC"/>
+        </w:rPr>
+        <w:t>Como solución se implementó</w:t>
+      </w:r>
       <w:r>
         <w:rPr>
           <w:lang w:val="es-EC"/>
         </w:rPr>
-        <w:t>Solución adoptada: Implementar un sistema de boletines bimensuales integrado en la plataforma web oficial del proyecto (https://proyecto-innovacion-e-internacional.vercel.app).</w:t>
+        <w:t xml:space="preserve"> un sistema de boletines bimensuales </w:t>
+      </w:r>
+      <w:r>
+        <w:rPr>
+          <w:rFonts w:ascii="Cambria" w:hAnsi="Cambria"/>
+          <w:lang w:val="es-EC"/>
+        </w:rPr>
+        <w:t>dentro de</w:t>
+      </w:r>
+      <w:r>
+        <w:rPr>
+          <w:lang w:val="es-EC"/>
+        </w:rPr>
+        <w:t xml:space="preserve"> la p</w:t>
+      </w:r>
+      <w:r>
+        <w:rPr>
+          <w:rFonts w:ascii="Cambria" w:hAnsi="Cambria"/>
+          <w:lang w:val="es-EC"/>
+        </w:rPr>
+        <w:t>ágin</w:t>
+      </w:r>
+      <w:r>
+        <w:rPr>
+          <w:lang w:val="es-EC"/>
+        </w:rPr>
+        <w:t xml:space="preserve">a web oficial </w:t>
+      </w:r>
+      <w:r>
+        <w:rPr>
+          <w:lang w:val="es-EC"/>
+        </w:rPr>
+        <w:t xml:space="preserve">de la carrera </w:t>
+      </w:r>
+      <w:hyperlink r:id="rId8" w:history="1">
+        <w:r>
+          <w:rPr>
+            <w:rStyle w:val="Hipervnculo"/>
+            <w:lang w:val="es-EC"/>
+          </w:rPr>
+          <w:t>https://carrerapineuleam.vercel.app/boletines</w:t>
+        </w:r>
+      </w:hyperlink>
+      <w:r>
+        <w:rPr>
+          <w:lang w:val="es-EC"/>
+        </w:rPr>
+        <w:t>.</w:t>
       </w:r>
     </w:p>
     <w:p>
       <w:pPr>
         <w:pStyle w:val="Ttulo1"/>
+        <w:jc w:val="both"/>
       </w:pPr>
       <w:r>
         <w:rPr>
@@ -356,6 +1078,7 @@
     <w:p>
       <w:pPr>
         <w:pStyle w:val="Ttulo2"/>
+        <w:jc w:val="both"/>
       </w:pPr>
       <w:r>
         <w:t>3.</w:t>
@@ -390,8 +1113,16 @@
             <w:tcW w:w="4320" w:type="dxa"/>
           </w:tcPr>
           <w:p>
+            <w:pPr>
+              <w:jc w:val="both"/>
+            </w:pPr>
+            <w:proofErr w:type="spellStart"/>
             <w:r>
-              <w:t>Dirección web:</w:t>
+              <w:t>Dirección</w:t>
+            </w:r>
+            <w:proofErr w:type="spellEnd"/>
+            <w:r>
+              <w:t xml:space="preserve"> web</w:t>
             </w:r>
           </w:p>
         </w:tc>
@@ -400,6 +1131,9 @@
             <w:tcW w:w="4320" w:type="dxa"/>
           </w:tcPr>
           <w:p>
+            <w:pPr>
+              <w:jc w:val="both"/>
+            </w:pPr>
             <w:r>
               <w:t>https://proyecto-innovacion-e-internacional.vercel.app/boletines</w:t>
             </w:r>
@@ -408,13 +1142,30 @@
       </w:tr>
     </w:tbl>
     <w:p>
+      <w:pPr>
+        <w:jc w:val="both"/>
+        <w:rPr>
+          <w:lang w:val="es-EC"/>
+        </w:rPr>
+      </w:pPr>
       <w:r>
-        <w:t>Características visuales: Encabezado y pie de página con identidad ULEAM, colores institucionales (azul #003366, dorado #FFD700), interfaz responsiva.</w:t>
+        <w:rPr>
+          <w:rFonts w:ascii="Cambria" w:hAnsi="Cambria"/>
+          <w:lang w:val="es-EC"/>
+        </w:rPr>
+        <w:t>La página presenta la identidad visual de la ULEAM en el encabezado y el pie, con los colores institucionales azul y dorado, y se adapta tanto a computadores como a teléfonos móviles</w:t>
+      </w:r>
+      <w:r>
+        <w:rPr>
+          <w:lang w:val="es-EC"/>
+        </w:rPr>
+        <w:t>.</w:t>
       </w:r>
     </w:p>
     <w:p>
       <w:pPr>
         <w:pStyle w:val="Ttulo1"/>
+        <w:jc w:val="both"/>
       </w:pPr>
       <w:r>
         <w:rPr>
@@ -426,6 +1177,7 @@
     <w:p>
       <w:pPr>
         <w:pStyle w:val="Ttulo2"/>
+        <w:jc w:val="both"/>
       </w:pPr>
       <w:r>
         <w:t>4.1 Bimestre III (Mayo — Junio 2026)</w:t>
@@ -438,38 +1190,71 @@
         <w:tblLook w:val="04A0" w:firstRow="1" w:lastRow="0" w:firstColumn="1" w:lastColumn="0" w:noHBand="0" w:noVBand="1"/>
       </w:tblPr>
       <w:tblGrid>
-        <w:gridCol w:w="2160"/>
-        <w:gridCol w:w="2160"/>
-        <w:gridCol w:w="2160"/>
+        <w:gridCol w:w="534"/>
+        <w:gridCol w:w="1417"/>
+        <w:gridCol w:w="4529"/>
         <w:gridCol w:w="2160"/>
       </w:tblGrid>
       <w:tr>
         <w:tc>
           <w:tcPr>
-            <w:tcW w:w="2160" w:type="dxa"/>
+            <w:tcW w:w="534" w:type="dxa"/>
           </w:tcPr>
           <w:p>
+            <w:pPr>
+              <w:jc w:val="both"/>
+              <w:rPr>
+                <w:b/>
+                <w:bCs/>
+              </w:rPr>
+            </w:pPr>
             <w:r>
+              <w:rPr>
+                <w:b/>
+                <w:bCs/>
+              </w:rPr>
               <w:t>#</w:t>
             </w:r>
           </w:p>
         </w:tc>
         <w:tc>
           <w:tcPr>
-            <w:tcW w:w="2160" w:type="dxa"/>
+            <w:tcW w:w="1417" w:type="dxa"/>
           </w:tcPr>
           <w:p>
+            <w:pPr>
+              <w:jc w:val="both"/>
+              <w:rPr>
+                <w:b/>
+                <w:bCs/>
+              </w:rPr>
+            </w:pPr>
             <w:r>
+              <w:rPr>
+                <w:b/>
+                <w:bCs/>
+              </w:rPr>
               <w:t>Tipo</w:t>
             </w:r>
           </w:p>
         </w:tc>
         <w:tc>
           <w:tcPr>
-            <w:tcW w:w="2160" w:type="dxa"/>
+            <w:tcW w:w="4529" w:type="dxa"/>
           </w:tcPr>
           <w:p>
+            <w:pPr>
+              <w:jc w:val="both"/>
+              <w:rPr>
+                <w:b/>
+                <w:bCs/>
+              </w:rPr>
+            </w:pPr>
             <w:r>
+              <w:rPr>
+                <w:b/>
+                <w:bCs/>
+              </w:rPr>
               <w:t>Título</w:t>
             </w:r>
           </w:p>
@@ -479,7 +1264,18 @@
             <w:tcW w:w="2160" w:type="dxa"/>
           </w:tcPr>
           <w:p>
+            <w:pPr>
+              <w:jc w:val="both"/>
+              <w:rPr>
+                <w:b/>
+                <w:bCs/>
+              </w:rPr>
+            </w:pPr>
             <w:r>
+              <w:rPr>
+                <w:b/>
+                <w:bCs/>
+              </w:rPr>
               <w:t>Fecha</w:t>
             </w:r>
           </w:p>
@@ -488,9 +1284,12 @@
       <w:tr>
         <w:tc>
           <w:tcPr>
-            <w:tcW w:w="2160" w:type="dxa"/>
+            <w:tcW w:w="534" w:type="dxa"/>
           </w:tcPr>
           <w:p>
+            <w:pPr>
+              <w:jc w:val="both"/>
+            </w:pPr>
             <w:r>
               <w:t>1</w:t>
             </w:r>
@@ -498,9 +1297,12 @@
         </w:tc>
         <w:tc>
           <w:tcPr>
-            <w:tcW w:w="2160" w:type="dxa"/>
+            <w:tcW w:w="1417" w:type="dxa"/>
           </w:tcPr>
           <w:p>
+            <w:pPr>
+              <w:jc w:val="both"/>
+            </w:pPr>
             <w:r>
               <w:t>Actividad</w:t>
             </w:r>
@@ -508,9 +1310,12 @@
         </w:tc>
         <w:tc>
           <w:tcPr>
-            <w:tcW w:w="2160" w:type="dxa"/>
+            <w:tcW w:w="4529" w:type="dxa"/>
           </w:tcPr>
           <w:p>
+            <w:pPr>
+              <w:jc w:val="both"/>
+            </w:pPr>
             <w:r>
               <w:t>Feria de Proyectos STEAM</w:t>
             </w:r>
@@ -521,6 +1326,9 @@
             <w:tcW w:w="2160" w:type="dxa"/>
           </w:tcPr>
           <w:p>
+            <w:pPr>
+              <w:jc w:val="both"/>
+            </w:pPr>
             <w:r>
               <w:t>2026-06-20</w:t>
             </w:r>
@@ -530,9 +1338,12 @@
       <w:tr>
         <w:tc>
           <w:tcPr>
-            <w:tcW w:w="2160" w:type="dxa"/>
+            <w:tcW w:w="534" w:type="dxa"/>
           </w:tcPr>
           <w:p>
+            <w:pPr>
+              <w:jc w:val="both"/>
+            </w:pPr>
             <w:r>
               <w:t>2</w:t>
             </w:r>
@@ -540,9 +1351,12 @@
         </w:tc>
         <w:tc>
           <w:tcPr>
-            <w:tcW w:w="2160" w:type="dxa"/>
+            <w:tcW w:w="1417" w:type="dxa"/>
           </w:tcPr>
           <w:p>
+            <w:pPr>
+              <w:jc w:val="both"/>
+            </w:pPr>
             <w:r>
               <w:t>Actividad</w:t>
             </w:r>
@@ -550,9 +1364,12 @@
         </w:tc>
         <w:tc>
           <w:tcPr>
-            <w:tcW w:w="2160" w:type="dxa"/>
+            <w:tcW w:w="4529" w:type="dxa"/>
           </w:tcPr>
           <w:p>
+            <w:pPr>
+              <w:jc w:val="both"/>
+            </w:pPr>
             <w:r>
               <w:t>Feria Estrategias Lectura Cuentos Infantiles (4to sem PINE)</w:t>
             </w:r>
@@ -563,6 +1380,9 @@
             <w:tcW w:w="2160" w:type="dxa"/>
           </w:tcPr>
           <w:p>
+            <w:pPr>
+              <w:jc w:val="both"/>
+            </w:pPr>
             <w:r>
               <w:t>2026-06-10</w:t>
             </w:r>
@@ -572,9 +1392,12 @@
       <w:tr>
         <w:tc>
           <w:tcPr>
-            <w:tcW w:w="2160" w:type="dxa"/>
+            <w:tcW w:w="534" w:type="dxa"/>
           </w:tcPr>
           <w:p>
+            <w:pPr>
+              <w:jc w:val="both"/>
+            </w:pPr>
             <w:r>
               <w:t>3</w:t>
             </w:r>
@@ -582,9 +1405,12 @@
         </w:tc>
         <w:tc>
           <w:tcPr>
-            <w:tcW w:w="2160" w:type="dxa"/>
+            <w:tcW w:w="1417" w:type="dxa"/>
           </w:tcPr>
           <w:p>
+            <w:pPr>
+              <w:jc w:val="both"/>
+            </w:pPr>
             <w:r>
               <w:t>Noticia</w:t>
             </w:r>
@@ -592,9 +1418,12 @@
         </w:tc>
         <w:tc>
           <w:tcPr>
-            <w:tcW w:w="2160" w:type="dxa"/>
+            <w:tcW w:w="4529" w:type="dxa"/>
           </w:tcPr>
           <w:p>
+            <w:pPr>
+              <w:jc w:val="both"/>
+            </w:pPr>
             <w:r>
               <w:t>Publicación: Podcast An Educational Innovation in Foreign Languages</w:t>
             </w:r>
@@ -605,6 +1434,9 @@
             <w:tcW w:w="2160" w:type="dxa"/>
           </w:tcPr>
           <w:p>
+            <w:pPr>
+              <w:jc w:val="both"/>
+            </w:pPr>
             <w:r>
               <w:t>2026-06-01</w:t>
             </w:r>
@@ -614,9 +1446,12 @@
       <w:tr>
         <w:tc>
           <w:tcPr>
-            <w:tcW w:w="2160" w:type="dxa"/>
+            <w:tcW w:w="534" w:type="dxa"/>
           </w:tcPr>
           <w:p>
+            <w:pPr>
+              <w:jc w:val="both"/>
+            </w:pPr>
             <w:r>
               <w:t>4</w:t>
             </w:r>
@@ -624,9 +1459,12 @@
         </w:tc>
         <w:tc>
           <w:tcPr>
-            <w:tcW w:w="2160" w:type="dxa"/>
+            <w:tcW w:w="1417" w:type="dxa"/>
           </w:tcPr>
           <w:p>
+            <w:pPr>
+              <w:jc w:val="both"/>
+            </w:pPr>
             <w:r>
               <w:t>Actividad</w:t>
             </w:r>
@@ -634,9 +1472,12 @@
         </w:tc>
         <w:tc>
           <w:tcPr>
-            <w:tcW w:w="2160" w:type="dxa"/>
+            <w:tcW w:w="4529" w:type="dxa"/>
           </w:tcPr>
           <w:p>
+            <w:pPr>
+              <w:jc w:val="both"/>
+            </w:pPr>
             <w:r>
               <w:t>Estrategia Enseñanza Inglés mediante Museos (5to sem)</w:t>
             </w:r>
@@ -647,6 +1488,9 @@
             <w:tcW w:w="2160" w:type="dxa"/>
           </w:tcPr>
           <w:p>
+            <w:pPr>
+              <w:jc w:val="both"/>
+            </w:pPr>
             <w:r>
               <w:t>2026-05-28</w:t>
             </w:r>
@@ -656,9 +1500,12 @@
       <w:tr>
         <w:tc>
           <w:tcPr>
-            <w:tcW w:w="2160" w:type="dxa"/>
+            <w:tcW w:w="534" w:type="dxa"/>
           </w:tcPr>
           <w:p>
+            <w:pPr>
+              <w:jc w:val="both"/>
+            </w:pPr>
             <w:r>
               <w:t>5</w:t>
             </w:r>
@@ -666,9 +1513,12 @@
         </w:tc>
         <w:tc>
           <w:tcPr>
-            <w:tcW w:w="2160" w:type="dxa"/>
+            <w:tcW w:w="1417" w:type="dxa"/>
           </w:tcPr>
           <w:p>
+            <w:pPr>
+              <w:jc w:val="both"/>
+            </w:pPr>
             <w:r>
               <w:t>Actividad</w:t>
             </w:r>
@@ -676,10 +1526,11 @@
         </w:tc>
         <w:tc>
           <w:tcPr>
-            <w:tcW w:w="2160" w:type="dxa"/>
+            <w:tcW w:w="4529" w:type="dxa"/>
           </w:tcPr>
           <w:p>
             <w:pPr>
+              <w:jc w:val="both"/>
               <w:rPr>
                 <w:lang w:val="es-EC"/>
               </w:rPr>
@@ -711,6 +1562,9 @@
             <w:tcW w:w="2160" w:type="dxa"/>
           </w:tcPr>
           <w:p>
+            <w:pPr>
+              <w:jc w:val="both"/>
+            </w:pPr>
             <w:r>
               <w:t>2026-05-30</w:t>
             </w:r>
@@ -720,9 +1574,12 @@
       <w:tr>
         <w:tc>
           <w:tcPr>
-            <w:tcW w:w="2160" w:type="dxa"/>
+            <w:tcW w:w="534" w:type="dxa"/>
           </w:tcPr>
           <w:p>
+            <w:pPr>
+              <w:jc w:val="both"/>
+            </w:pPr>
             <w:r>
               <w:t>6</w:t>
             </w:r>
@@ -730,9 +1587,12 @@
         </w:tc>
         <w:tc>
           <w:tcPr>
-            <w:tcW w:w="2160" w:type="dxa"/>
+            <w:tcW w:w="1417" w:type="dxa"/>
           </w:tcPr>
           <w:p>
+            <w:pPr>
+              <w:jc w:val="both"/>
+            </w:pPr>
             <w:r>
               <w:t>Actividad</w:t>
             </w:r>
@@ -740,10 +1600,11 @@
         </w:tc>
         <w:tc>
           <w:tcPr>
-            <w:tcW w:w="2160" w:type="dxa"/>
+            <w:tcW w:w="4529" w:type="dxa"/>
           </w:tcPr>
           <w:p>
             <w:pPr>
+              <w:jc w:val="both"/>
               <w:rPr>
                 <w:lang w:val="es-EC"/>
               </w:rPr>
@@ -761,6 +1622,9 @@
             <w:tcW w:w="2160" w:type="dxa"/>
           </w:tcPr>
           <w:p>
+            <w:pPr>
+              <w:jc w:val="both"/>
+            </w:pPr>
             <w:r>
               <w:t>2026-05-25</w:t>
             </w:r>
@@ -769,17 +1633,39 @@
       </w:tr>
     </w:tbl>
     <w:p>
+      <w:pPr>
+        <w:jc w:val="both"/>
+      </w:pPr>
       <w:r>
         <w:rPr>
           <w:b/>
         </w:rPr>
-        <w:t>Total Bimestre III: 6 contenidos publicados</w:t>
+        <w:t xml:space="preserve">Total </w:t>
+      </w:r>
+      <w:proofErr w:type="spellStart"/>
+      <w:r>
+        <w:rPr>
+          <w:b/>
+        </w:rPr>
+        <w:t>Bimestre</w:t>
+      </w:r>
+      <w:proofErr w:type="spellEnd"/>
+      <w:r>
+        <w:rPr>
+          <w:b/>
+        </w:rPr>
+        <w:t xml:space="preserve"> III: 6 contenidos publicados</w:t>
       </w:r>
     </w:p>
-    <w:p/>
     <w:p>
       <w:pPr>
+        <w:jc w:val="both"/>
+      </w:pPr>
+    </w:p>
+    <w:p>
+      <w:pPr>
         <w:pStyle w:val="Ttulo2"/>
+        <w:jc w:val="both"/>
       </w:pPr>
       <w:r>
         <w:t>4.2 Bimestre IV (Julio — Agosto 2026)</w:t>
@@ -792,38 +1678,71 @@
         <w:tblLook w:val="04A0" w:firstRow="1" w:lastRow="0" w:firstColumn="1" w:lastColumn="0" w:noHBand="0" w:noVBand="1"/>
       </w:tblPr>
       <w:tblGrid>
-        <w:gridCol w:w="2160"/>
-        <w:gridCol w:w="2160"/>
-        <w:gridCol w:w="2160"/>
+        <w:gridCol w:w="675"/>
+        <w:gridCol w:w="1560"/>
+        <w:gridCol w:w="4245"/>
         <w:gridCol w:w="2160"/>
       </w:tblGrid>
       <w:tr>
         <w:tc>
           <w:tcPr>
-            <w:tcW w:w="2160" w:type="dxa"/>
+            <w:tcW w:w="675" w:type="dxa"/>
           </w:tcPr>
           <w:p>
+            <w:pPr>
+              <w:jc w:val="both"/>
+              <w:rPr>
+                <w:b/>
+                <w:bCs/>
+              </w:rPr>
+            </w:pPr>
             <w:r>
+              <w:rPr>
+                <w:b/>
+                <w:bCs/>
+              </w:rPr>
               <w:t>#</w:t>
             </w:r>
           </w:p>
         </w:tc>
         <w:tc>
           <w:tcPr>
-            <w:tcW w:w="2160" w:type="dxa"/>
+            <w:tcW w:w="1560" w:type="dxa"/>
           </w:tcPr>
           <w:p>
+            <w:pPr>
+              <w:jc w:val="both"/>
+              <w:rPr>
+                <w:b/>
+                <w:bCs/>
+              </w:rPr>
+            </w:pPr>
             <w:r>
+              <w:rPr>
+                <w:b/>
+                <w:bCs/>
+              </w:rPr>
               <w:t>Tipo</w:t>
             </w:r>
           </w:p>
         </w:tc>
         <w:tc>
           <w:tcPr>
-            <w:tcW w:w="2160" w:type="dxa"/>
+            <w:tcW w:w="4245" w:type="dxa"/>
           </w:tcPr>
           <w:p>
+            <w:pPr>
+              <w:jc w:val="both"/>
+              <w:rPr>
+                <w:b/>
+                <w:bCs/>
+              </w:rPr>
+            </w:pPr>
             <w:r>
+              <w:rPr>
+                <w:b/>
+                <w:bCs/>
+              </w:rPr>
               <w:t>Título</w:t>
             </w:r>
           </w:p>
@@ -833,7 +1752,18 @@
             <w:tcW w:w="2160" w:type="dxa"/>
           </w:tcPr>
           <w:p>
+            <w:pPr>
+              <w:jc w:val="both"/>
+              <w:rPr>
+                <w:b/>
+                <w:bCs/>
+              </w:rPr>
+            </w:pPr>
             <w:r>
+              <w:rPr>
+                <w:b/>
+                <w:bCs/>
+              </w:rPr>
               <w:t>Fecha</w:t>
             </w:r>
           </w:p>
@@ -842,9 +1772,12 @@
       <w:tr>
         <w:tc>
           <w:tcPr>
-            <w:tcW w:w="2160" w:type="dxa"/>
+            <w:tcW w:w="675" w:type="dxa"/>
           </w:tcPr>
           <w:p>
+            <w:pPr>
+              <w:jc w:val="both"/>
+            </w:pPr>
             <w:r>
               <w:t>1</w:t>
             </w:r>
@@ -852,9 +1785,12 @@
         </w:tc>
         <w:tc>
           <w:tcPr>
-            <w:tcW w:w="2160" w:type="dxa"/>
+            <w:tcW w:w="1560" w:type="dxa"/>
           </w:tcPr>
           <w:p>
+            <w:pPr>
+              <w:jc w:val="both"/>
+            </w:pPr>
             <w:r>
               <w:t>Actividad</w:t>
             </w:r>
@@ -862,10 +1798,11 @@
         </w:tc>
         <w:tc>
           <w:tcPr>
-            <w:tcW w:w="2160" w:type="dxa"/>
+            <w:tcW w:w="4245" w:type="dxa"/>
           </w:tcPr>
           <w:p>
             <w:pPr>
+              <w:jc w:val="both"/>
               <w:rPr>
                 <w:lang w:val="es-EC"/>
               </w:rPr>
@@ -883,6 +1820,9 @@
             <w:tcW w:w="2160" w:type="dxa"/>
           </w:tcPr>
           <w:p>
+            <w:pPr>
+              <w:jc w:val="both"/>
+            </w:pPr>
             <w:r>
               <w:t>2026-07-15</w:t>
             </w:r>
@@ -892,9 +1832,12 @@
       <w:tr>
         <w:tc>
           <w:tcPr>
-            <w:tcW w:w="2160" w:type="dxa"/>
+            <w:tcW w:w="675" w:type="dxa"/>
           </w:tcPr>
           <w:p>
+            <w:pPr>
+              <w:jc w:val="both"/>
+            </w:pPr>
             <w:r>
               <w:t>2</w:t>
             </w:r>
@@ -902,11 +1845,33 @@
         </w:tc>
         <w:tc>
           <w:tcPr>
-            <w:tcW w:w="2160" w:type="dxa"/>
+            <w:tcW w:w="1560" w:type="dxa"/>
           </w:tcPr>
           <w:p>
+            <w:pPr>
+              <w:jc w:val="both"/>
+            </w:pPr>
             <w:r>
               <w:t>Actividad</w:t>
+            </w:r>
+          </w:p>
+        </w:tc>
+        <w:tc>
+          <w:tcPr>
+            <w:tcW w:w="4245" w:type="dxa"/>
+          </w:tcPr>
+          <w:p>
+            <w:pPr>
+              <w:jc w:val="both"/>
+              <w:rPr>
+                <w:lang w:val="es-EC"/>
+              </w:rPr>
+            </w:pPr>
+            <w:r>
+              <w:rPr>
+                <w:lang w:val="es-EC"/>
+              </w:rPr>
+              <w:t>Educación Inclusiva en Aula de Inglés — TDAH y TES</w:t>
             </w:r>
           </w:p>
         </w:tc>
@@ -916,32 +1881,9 @@
           </w:tcPr>
           <w:p>
             <w:pPr>
-              <w:rPr>
-                <w:lang w:val="es-EC"/>
-              </w:rPr>
+              <w:jc w:val="both"/>
             </w:pPr>
             <w:r>
-              <w:rPr>
-                <w:lang w:val="es-EC"/>
-              </w:rPr>
-              <w:t xml:space="preserve">Educación Inclusiva en Aula de Inglés — </w:t>
-            </w:r>
-            <w:r>
-              <w:rPr>
-                <w:lang w:val="es-EC"/>
-              </w:rPr>
-              <w:lastRenderedPageBreak/>
-              <w:t>TDAH y TES</w:t>
-            </w:r>
-          </w:p>
-        </w:tc>
-        <w:tc>
-          <w:tcPr>
-            <w:tcW w:w="2160" w:type="dxa"/>
-          </w:tcPr>
-          <w:p>
-            <w:r>
-              <w:lastRenderedPageBreak/>
               <w:t>2026-07-01</w:t>
             </w:r>
           </w:p>
@@ -950,9 +1892,12 @@
       <w:tr>
         <w:tc>
           <w:tcPr>
-            <w:tcW w:w="2160" w:type="dxa"/>
+            <w:tcW w:w="675" w:type="dxa"/>
           </w:tcPr>
           <w:p>
+            <w:pPr>
+              <w:jc w:val="both"/>
+            </w:pPr>
             <w:r>
               <w:t>3</w:t>
             </w:r>
@@ -960,9 +1905,12 @@
         </w:tc>
         <w:tc>
           <w:tcPr>
-            <w:tcW w:w="2160" w:type="dxa"/>
+            <w:tcW w:w="1560" w:type="dxa"/>
           </w:tcPr>
           <w:p>
+            <w:pPr>
+              <w:jc w:val="both"/>
+            </w:pPr>
             <w:r>
               <w:t>Noticia</w:t>
             </w:r>
@@ -970,10 +1918,11 @@
         </w:tc>
         <w:tc>
           <w:tcPr>
-            <w:tcW w:w="2160" w:type="dxa"/>
+            <w:tcW w:w="4245" w:type="dxa"/>
           </w:tcPr>
           <w:p>
             <w:pPr>
+              <w:jc w:val="both"/>
               <w:rPr>
                 <w:lang w:val="es-EC"/>
               </w:rPr>
@@ -991,6 +1940,9 @@
             <w:tcW w:w="2160" w:type="dxa"/>
           </w:tcPr>
           <w:p>
+            <w:pPr>
+              <w:jc w:val="both"/>
+            </w:pPr>
             <w:r>
               <w:t>2026-07-10</w:t>
             </w:r>
@@ -1000,9 +1952,12 @@
       <w:tr>
         <w:tc>
           <w:tcPr>
-            <w:tcW w:w="2160" w:type="dxa"/>
+            <w:tcW w:w="675" w:type="dxa"/>
           </w:tcPr>
           <w:p>
+            <w:pPr>
+              <w:jc w:val="both"/>
+            </w:pPr>
             <w:r>
               <w:t>4</w:t>
             </w:r>
@@ -1010,9 +1965,12 @@
         </w:tc>
         <w:tc>
           <w:tcPr>
-            <w:tcW w:w="2160" w:type="dxa"/>
+            <w:tcW w:w="1560" w:type="dxa"/>
           </w:tcPr>
           <w:p>
+            <w:pPr>
+              <w:jc w:val="both"/>
+            </w:pPr>
             <w:r>
               <w:t>Actividad</w:t>
             </w:r>
@@ -1020,10 +1978,11 @@
         </w:tc>
         <w:tc>
           <w:tcPr>
-            <w:tcW w:w="2160" w:type="dxa"/>
+            <w:tcW w:w="4245" w:type="dxa"/>
           </w:tcPr>
           <w:p>
             <w:pPr>
+              <w:jc w:val="both"/>
               <w:rPr>
                 <w:lang w:val="es-EC"/>
               </w:rPr>
@@ -1041,6 +2000,9 @@
             <w:tcW w:w="2160" w:type="dxa"/>
           </w:tcPr>
           <w:p>
+            <w:pPr>
+              <w:jc w:val="both"/>
+            </w:pPr>
             <w:r>
               <w:t>2026-08-08</w:t>
             </w:r>
@@ -1050,9 +2012,12 @@
       <w:tr>
         <w:tc>
           <w:tcPr>
-            <w:tcW w:w="2160" w:type="dxa"/>
+            <w:tcW w:w="675" w:type="dxa"/>
           </w:tcPr>
           <w:p>
+            <w:pPr>
+              <w:jc w:val="both"/>
+            </w:pPr>
             <w:r>
               <w:t>5</w:t>
             </w:r>
@@ -1060,9 +2025,12 @@
         </w:tc>
         <w:tc>
           <w:tcPr>
-            <w:tcW w:w="2160" w:type="dxa"/>
+            <w:tcW w:w="1560" w:type="dxa"/>
           </w:tcPr>
           <w:p>
+            <w:pPr>
+              <w:jc w:val="both"/>
+            </w:pPr>
             <w:r>
               <w:t>Noticia</w:t>
             </w:r>
@@ -1070,9 +2038,12 @@
         </w:tc>
         <w:tc>
           <w:tcPr>
-            <w:tcW w:w="2160" w:type="dxa"/>
+            <w:tcW w:w="4245" w:type="dxa"/>
           </w:tcPr>
           <w:p>
+            <w:pPr>
+              <w:jc w:val="both"/>
+            </w:pPr>
             <w:r>
               <w:t>Innovaciones Educativas — Reporte de Avances</w:t>
             </w:r>
@@ -1083,6 +2054,9 @@
             <w:tcW w:w="2160" w:type="dxa"/>
           </w:tcPr>
           <w:p>
+            <w:pPr>
+              <w:jc w:val="both"/>
+            </w:pPr>
             <w:r>
               <w:t>2026-08-05</w:t>
             </w:r>
@@ -1091,21 +2065,68 @@
       </w:tr>
     </w:tbl>
     <w:p>
+      <w:pPr>
+        <w:jc w:val="both"/>
+      </w:pPr>
       <w:r>
         <w:rPr>
           <w:b/>
         </w:rPr>
-        <w:t>Total Bimestre IV: 5 contenidos publicados</w:t>
+        <w:t xml:space="preserve">Total </w:t>
+      </w:r>
+      <w:proofErr w:type="spellStart"/>
+      <w:r>
+        <w:rPr>
+          <w:b/>
+        </w:rPr>
+        <w:t>Bimestre</w:t>
+      </w:r>
+      <w:proofErr w:type="spellEnd"/>
+      <w:r>
+        <w:rPr>
+          <w:b/>
+        </w:rPr>
+        <w:t xml:space="preserve"> IV: 5 contenidos publicados</w:t>
       </w:r>
     </w:p>
-    <w:p/>
     <w:p>
       <w:pPr>
+        <w:jc w:val="both"/>
+      </w:pPr>
+      <w:r>
+        <w:br w:type="page"/>
+      </w:r>
+    </w:p>
+    <w:p>
+      <w:pPr>
         <w:pStyle w:val="Ttulo2"/>
+        <w:jc w:val="both"/>
       </w:pPr>
       <w:r>
-        <w:t>4.3 Resumen Período Reportado</w:t>
+        <w:lastRenderedPageBreak/>
+        <w:t xml:space="preserve">4.3 </w:t>
       </w:r>
+      <w:proofErr w:type="spellStart"/>
+      <w:r>
+        <w:t>Resumen</w:t>
+      </w:r>
+      <w:proofErr w:type="spellEnd"/>
+      <w:r>
+        <w:t xml:space="preserve"> </w:t>
+      </w:r>
+      <w:proofErr w:type="spellStart"/>
+      <w:r>
+        <w:t>Período</w:t>
+      </w:r>
+      <w:proofErr w:type="spellEnd"/>
+      <w:r>
+        <w:t xml:space="preserve"> </w:t>
+      </w:r>
+      <w:proofErr w:type="spellStart"/>
+      <w:r>
+        <w:t>Reportado</w:t>
+      </w:r>
+      <w:proofErr w:type="spellEnd"/>
     </w:p>
     <w:tbl>
       <w:tblPr>
@@ -1114,48 +2135,94 @@
         <w:tblLook w:val="04A0" w:firstRow="1" w:lastRow="0" w:firstColumn="1" w:lastColumn="0" w:noHBand="0" w:noVBand="1"/>
       </w:tblPr>
       <w:tblGrid>
-        <w:gridCol w:w="2160"/>
-        <w:gridCol w:w="2160"/>
-        <w:gridCol w:w="2160"/>
-        <w:gridCol w:w="2160"/>
+        <w:gridCol w:w="4077"/>
+        <w:gridCol w:w="1560"/>
+        <w:gridCol w:w="1417"/>
+        <w:gridCol w:w="1586"/>
       </w:tblGrid>
       <w:tr>
         <w:tc>
           <w:tcPr>
-            <w:tcW w:w="2160" w:type="dxa"/>
+            <w:tcW w:w="4077" w:type="dxa"/>
           </w:tcPr>
           <w:p>
+            <w:pPr>
+              <w:jc w:val="both"/>
+              <w:rPr>
+                <w:b/>
+                <w:bCs/>
+              </w:rPr>
+            </w:pPr>
+            <w:proofErr w:type="spellStart"/>
             <w:r>
+              <w:rPr>
+                <w:b/>
+                <w:bCs/>
+              </w:rPr>
               <w:t>Período</w:t>
             </w:r>
+            <w:proofErr w:type="spellEnd"/>
           </w:p>
         </w:tc>
         <w:tc>
           <w:tcPr>
-            <w:tcW w:w="2160" w:type="dxa"/>
+            <w:tcW w:w="1560" w:type="dxa"/>
           </w:tcPr>
           <w:p>
+            <w:pPr>
+              <w:jc w:val="both"/>
+              <w:rPr>
+                <w:b/>
+                <w:bCs/>
+              </w:rPr>
+            </w:pPr>
             <w:r>
+              <w:rPr>
+                <w:b/>
+                <w:bCs/>
+              </w:rPr>
               <w:t>Noticias</w:t>
             </w:r>
           </w:p>
         </w:tc>
         <w:tc>
           <w:tcPr>
-            <w:tcW w:w="2160" w:type="dxa"/>
+            <w:tcW w:w="1417" w:type="dxa"/>
           </w:tcPr>
           <w:p>
+            <w:pPr>
+              <w:jc w:val="both"/>
+              <w:rPr>
+                <w:b/>
+                <w:bCs/>
+              </w:rPr>
+            </w:pPr>
             <w:r>
+              <w:rPr>
+                <w:b/>
+                <w:bCs/>
+              </w:rPr>
               <w:t>Actividades</w:t>
             </w:r>
           </w:p>
         </w:tc>
         <w:tc>
           <w:tcPr>
-            <w:tcW w:w="2160" w:type="dxa"/>
+            <w:tcW w:w="1586" w:type="dxa"/>
           </w:tcPr>
           <w:p>
+            <w:pPr>
+              <w:jc w:val="both"/>
+              <w:rPr>
+                <w:b/>
+                <w:bCs/>
+              </w:rPr>
+            </w:pPr>
             <w:r>
+              <w:rPr>
+                <w:b/>
+                <w:bCs/>
+              </w:rPr>
               <w:t>Total</w:t>
             </w:r>
           </w:p>
@@ -1164,9 +2231,12 @@
       <w:tr>
         <w:tc>
           <w:tcPr>
-            <w:tcW w:w="2160" w:type="dxa"/>
+            <w:tcW w:w="4077" w:type="dxa"/>
           </w:tcPr>
           <w:p>
+            <w:pPr>
+              <w:jc w:val="both"/>
+            </w:pPr>
             <w:r>
               <w:t>Bimestre III (May–Jun)</w:t>
             </w:r>
@@ -1174,9 +2244,12 @@
         </w:tc>
         <w:tc>
           <w:tcPr>
-            <w:tcW w:w="2160" w:type="dxa"/>
+            <w:tcW w:w="1560" w:type="dxa"/>
           </w:tcPr>
           <w:p>
+            <w:pPr>
+              <w:jc w:val="both"/>
+            </w:pPr>
             <w:r>
               <w:t>1</w:t>
             </w:r>
@@ -1184,9 +2257,12 @@
         </w:tc>
         <w:tc>
           <w:tcPr>
-            <w:tcW w:w="2160" w:type="dxa"/>
+            <w:tcW w:w="1417" w:type="dxa"/>
           </w:tcPr>
           <w:p>
+            <w:pPr>
+              <w:jc w:val="both"/>
+            </w:pPr>
             <w:r>
               <w:t>5</w:t>
             </w:r>
@@ -1194,9 +2270,12 @@
         </w:tc>
         <w:tc>
           <w:tcPr>
-            <w:tcW w:w="2160" w:type="dxa"/>
+            <w:tcW w:w="1586" w:type="dxa"/>
           </w:tcPr>
           <w:p>
+            <w:pPr>
+              <w:jc w:val="both"/>
+            </w:pPr>
             <w:r>
               <w:t>6</w:t>
             </w:r>
@@ -1206,9 +2285,12 @@
       <w:tr>
         <w:tc>
           <w:tcPr>
-            <w:tcW w:w="2160" w:type="dxa"/>
+            <w:tcW w:w="4077" w:type="dxa"/>
           </w:tcPr>
           <w:p>
+            <w:pPr>
+              <w:jc w:val="both"/>
+            </w:pPr>
             <w:r>
               <w:t>Bimestre IV (Jul–Ago)</w:t>
             </w:r>
@@ -1216,9 +2298,12 @@
         </w:tc>
         <w:tc>
           <w:tcPr>
-            <w:tcW w:w="2160" w:type="dxa"/>
+            <w:tcW w:w="1560" w:type="dxa"/>
           </w:tcPr>
           <w:p>
+            <w:pPr>
+              <w:jc w:val="both"/>
+            </w:pPr>
             <w:r>
               <w:t>2</w:t>
             </w:r>
@@ -1226,9 +2311,12 @@
         </w:tc>
         <w:tc>
           <w:tcPr>
-            <w:tcW w:w="2160" w:type="dxa"/>
+            <w:tcW w:w="1417" w:type="dxa"/>
           </w:tcPr>
           <w:p>
+            <w:pPr>
+              <w:jc w:val="both"/>
+            </w:pPr>
             <w:r>
               <w:t>3</w:t>
             </w:r>
@@ -1236,9 +2324,12 @@
         </w:tc>
         <w:tc>
           <w:tcPr>
-            <w:tcW w:w="2160" w:type="dxa"/>
+            <w:tcW w:w="1586" w:type="dxa"/>
           </w:tcPr>
           <w:p>
+            <w:pPr>
+              <w:jc w:val="both"/>
+            </w:pPr>
             <w:r>
               <w:t>5</w:t>
             </w:r>
@@ -1248,9 +2339,12 @@
       <w:tr>
         <w:tc>
           <w:tcPr>
-            <w:tcW w:w="2160" w:type="dxa"/>
+            <w:tcW w:w="4077" w:type="dxa"/>
           </w:tcPr>
           <w:p>
+            <w:pPr>
+              <w:jc w:val="both"/>
+            </w:pPr>
             <w:r>
               <w:rPr>
                 <w:b/>
@@ -1261,9 +2355,12 @@
         </w:tc>
         <w:tc>
           <w:tcPr>
-            <w:tcW w:w="2160" w:type="dxa"/>
+            <w:tcW w:w="1560" w:type="dxa"/>
           </w:tcPr>
           <w:p>
+            <w:pPr>
+              <w:jc w:val="both"/>
+            </w:pPr>
             <w:r>
               <w:rPr>
                 <w:b/>
@@ -1274,9 +2371,12 @@
         </w:tc>
         <w:tc>
           <w:tcPr>
-            <w:tcW w:w="2160" w:type="dxa"/>
+            <w:tcW w:w="1417" w:type="dxa"/>
           </w:tcPr>
           <w:p>
+            <w:pPr>
+              <w:jc w:val="both"/>
+            </w:pPr>
             <w:r>
               <w:rPr>
                 <w:b/>
@@ -1287,9 +2387,12 @@
         </w:tc>
         <w:tc>
           <w:tcPr>
-            <w:tcW w:w="2160" w:type="dxa"/>
+            <w:tcW w:w="1586" w:type="dxa"/>
           </w:tcPr>
           <w:p>
+            <w:pPr>
+              <w:jc w:val="both"/>
+            </w:pPr>
             <w:r>
               <w:rPr>
                 <w:b/>
@@ -1301,168 +2404,36 @@
       </w:tr>
     </w:tbl>
     <w:p>
-      <w:r>
-        <w:br w:type="page"/>
-      </w:r>
-    </w:p>
-    <w:p>
       <w:pPr>
         <w:pStyle w:val="Ttulo1"/>
+        <w:jc w:val="both"/>
       </w:pPr>
       <w:r>
         <w:rPr>
           <w:color w:val="003366"/>
         </w:rPr>
-        <w:lastRenderedPageBreak/>
         <w:t>5. Funcionamiento del Sistema</w:t>
       </w:r>
     </w:p>
     <w:p>
       <w:pPr>
         <w:pStyle w:val="Ttulo2"/>
+        <w:jc w:val="both"/>
       </w:pPr>
       <w:r>
-        <w:t>5.1 Flujo de Trabajo</w:t>
-      </w:r>
-    </w:p>
-    <w:p>
-      <w:pPr>
-        <w:pStyle w:val="Listaconnmeros"/>
-      </w:pPr>
-      <w:r>
-        <w:t>1. CREAR CONTENIDO (Admin Panel)</w:t>
-      </w:r>
-    </w:p>
-    <w:p>
-      <w:pPr>
-        <w:pStyle w:val="Listaconvietas"/>
-        <w:rPr>
-          <w:lang w:val="es-EC"/>
-        </w:rPr>
-      </w:pPr>
-      <w:r>
-        <w:rPr>
-          <w:lang w:val="es-EC"/>
-        </w:rPr>
-        <w:t>Noticia o Actividad + fecha ISO (YYYY-MM-DD)</w:t>
-      </w:r>
-    </w:p>
-    <w:p>
-      <w:pPr>
-        <w:pStyle w:val="Listaconnmeros"/>
-      </w:pPr>
-      <w:r>
-        <w:t>2. GUARDAR EN BASE DE DATOS</w:t>
-      </w:r>
-    </w:p>
-    <w:p>
-      <w:pPr>
-        <w:pStyle w:val="Listaconvietas"/>
-      </w:pPr>
-      <w:r>
-        <w:t>Almacena en /lib/data.ts</w:t>
-      </w:r>
-    </w:p>
-    <w:p>
-      <w:pPr>
-        <w:pStyle w:val="Listaconnmeros"/>
-      </w:pPr>
-      <w:r>
-        <w:t>3. AGRUPACIÓN AUTOMÁTICA</w:t>
-      </w:r>
-    </w:p>
-    <w:p>
-      <w:pPr>
-        <w:pStyle w:val="Listaconvietas"/>
-        <w:rPr>
-          <w:lang w:val="es-EC"/>
-        </w:rPr>
-      </w:pPr>
-      <w:r>
-        <w:rPr>
-          <w:lang w:val="es-EC"/>
-        </w:rPr>
-        <w:t>Motor calcula bimestre: mes 5-6 → Bimestre III, mes 7-8 → Bimestre IV</w:t>
-      </w:r>
-    </w:p>
-    <w:p>
-      <w:pPr>
-        <w:pStyle w:val="Listaconnmeros"/>
-      </w:pPr>
-      <w:r>
-        <w:t>4. PUBLICACIÓN PÚBLICA</w:t>
-      </w:r>
-    </w:p>
-    <w:p>
-      <w:pPr>
-        <w:pStyle w:val="Listaconvietas"/>
-      </w:pPr>
-      <w:r>
-        <w:t>Aparece automáticamente en /boletines</w:t>
-      </w:r>
-    </w:p>
-    <w:p>
-      <w:pPr>
-        <w:pStyle w:val="Listaconnmeros"/>
-      </w:pPr>
-      <w:r>
-        <w:t>5. USUARIOS CONSULTAN</w:t>
-      </w:r>
-    </w:p>
-    <w:p>
-      <w:pPr>
-        <w:pStyle w:val="Listaconvietas"/>
-      </w:pPr>
-      <w:r>
-        <w:t>Acceso sin restricción, ruta pública</w:t>
-      </w:r>
-    </w:p>
-    <w:p>
-      <w:pPr>
-        <w:pStyle w:val="Ttulo2"/>
-      </w:pPr>
-      <w:r>
-        <w:t>5.2 Ventaja: Cero Configuración Manual</w:t>
-      </w:r>
-    </w:p>
-    <w:p>
-      <w:pPr>
-        <w:pStyle w:val="Listaconvietas"/>
-        <w:rPr>
-          <w:lang w:val="es-EC"/>
-        </w:rPr>
-      </w:pPr>
-      <w:r>
-        <w:rPr>
-          <w:lang w:val="es-EC"/>
-        </w:rPr>
-        <w:t>Crear noticia → aparece en boletín automáticamente</w:t>
-      </w:r>
-    </w:p>
-    <w:p>
-      <w:pPr>
-        <w:pStyle w:val="Listaconvietas"/>
-        <w:rPr>
-          <w:lang w:val="es-EC"/>
-        </w:rPr>
-      </w:pPr>
-      <w:r>
-        <w:rPr>
-          <w:lang w:val="es-EC"/>
-        </w:rPr>
-        <w:t>Agregar actividad → incluida sin paso adicional</w:t>
-      </w:r>
-    </w:p>
-    <w:p>
-      <w:pPr>
-        <w:pStyle w:val="Listaconvietas"/>
-      </w:pPr>
-      <w:r>
-        <w:t xml:space="preserve">No </w:t>
+        <w:t xml:space="preserve">5.1 </w:t>
       </w:r>
       <w:proofErr w:type="spellStart"/>
       <w:r>
-        <w:t>requiere</w:t>
+        <w:t>Cómo</w:t>
+      </w:r>
+      <w:proofErr w:type="spellEnd"/>
+      <w:r>
+        <w:t xml:space="preserve"> se </w:t>
+      </w:r>
+      <w:proofErr w:type="spellStart"/>
+      <w:r>
+        <w:t>elaboran</w:t>
       </w:r>
       <w:proofErr w:type="spellEnd"/>
       <w:r>
@@ -1470,7 +2441,7 @@
       </w:r>
       <w:proofErr w:type="spellStart"/>
       <w:r>
-        <w:t>editar</w:t>
+        <w:t>los</w:t>
       </w:r>
       <w:proofErr w:type="spellEnd"/>
       <w:r>
@@ -1478,21 +2449,65 @@
       </w:r>
       <w:proofErr w:type="spellStart"/>
       <w:r>
-        <w:t>código</w:t>
+        <w:t>boletines</w:t>
       </w:r>
       <w:proofErr w:type="spellEnd"/>
     </w:p>
     <w:p>
       <w:pPr>
-        <w:pStyle w:val="Listaconvietas"/>
+        <w:jc w:val="both"/>
+        <w:rPr>
+          <w:rFonts w:ascii="Cambria" w:hAnsi="Cambria"/>
+          <w:color w:val="000000"/>
+          <w:lang w:val="es-EC"/>
+        </w:rPr>
       </w:pPr>
       <w:r>
-        <w:t>Escalable a nuevos contenidos</w:t>
+        <w:rPr>
+          <w:rFonts w:ascii="Cambria" w:hAnsi="Cambria"/>
+          <w:color w:val="000000"/>
+          <w:lang w:val="es-EC"/>
+        </w:rPr>
+        <w:t>El proceso para elaborar los boletines es sencillo y en gran parte automático. Cuando la carrera registra una noticia o una actividad, indica su fecha y el sistema se encarga del resto. Cada contenido queda guardado y ordenado en el bimestre que le corresponde según el mes en que ocurrió, de manera que lo publicado en mayo y junio se agrupa en el Bimestre III y lo publicado en julio y agosto en el Bimestre IV. Una vez registrado, el contenido aparece publicado en la sección de boletines y queda disponible para cualquier persona que quiera consultarlo, sin necesidad de registro ni permisos.</w:t>
       </w:r>
     </w:p>
     <w:p>
       <w:pPr>
+        <w:pStyle w:val="Ttulo2"/>
+        <w:jc w:val="both"/>
+        <w:rPr>
+          <w:lang w:val="es-EC"/>
+        </w:rPr>
+      </w:pPr>
+      <w:r>
+        <w:rPr>
+          <w:lang w:val="es-EC"/>
+        </w:rPr>
+        <w:t>5.2 Actualización automática</w:t>
+      </w:r>
+    </w:p>
+    <w:p>
+      <w:pPr>
+        <w:jc w:val="both"/>
+        <w:rPr>
+          <w:rFonts w:ascii="Cambria" w:hAnsi="Cambria"/>
+          <w:color w:val="000000"/>
+          <w:lang w:val="es-EC"/>
+        </w:rPr>
+      </w:pPr>
+      <w:r>
+        <w:rPr>
+          <w:rFonts w:ascii="Cambria" w:hAnsi="Cambria"/>
+          <w:color w:val="000000"/>
+          <w:lang w:val="es-EC"/>
+        </w:rPr>
+        <w:t>La mayor ventaja de este esquema es que no exige ninguna preparación técnica. Basta con registrar una noticia o una actividad para que aparezca en el boletín del bimestre correspondiente, sin pasos adicionales y sin que nadie tenga que modificar la página. El sistema admite además cualquier cantidad de contenidos nuevos, por lo que puede acompañar el crecimiento de la carrera sin cambios.</w:t>
+      </w:r>
+    </w:p>
+    <w:p>
+      <w:pPr>
         <w:pStyle w:val="Ttulo1"/>
+        <w:jc w:val="both"/>
       </w:pPr>
       <w:r>
         <w:rPr>
@@ -1504,6 +2519,7 @@
     <w:p>
       <w:pPr>
         <w:pStyle w:val="Listaconvietas"/>
+        <w:jc w:val="both"/>
         <w:rPr>
           <w:lang w:val="es-EC"/>
         </w:rPr>
@@ -1518,6 +2534,7 @@
     <w:p>
       <w:pPr>
         <w:pStyle w:val="Listaconvietas"/>
+        <w:jc w:val="both"/>
         <w:rPr>
           <w:lang w:val="es-EC"/>
         </w:rPr>
@@ -1526,12 +2543,28 @@
         <w:rPr>
           <w:lang w:val="es-EC"/>
         </w:rPr>
-        <w:t>El sistema está operativo y accesible públicamente en https://proyecto-innovacion-e-internacional.vercel.app/boletines.</w:t>
+        <w:t xml:space="preserve">El sistema está operativo y accesible públicamente en </w:t>
+      </w:r>
+      <w:hyperlink r:id="rId9" w:history="1">
+        <w:r>
+          <w:rPr>
+            <w:rStyle w:val="Hipervnculo"/>
+            <w:lang w:val="es-EC"/>
+          </w:rPr>
+          <w:t>https://carrerapineuleam.vercel.app/boletines</w:t>
+        </w:r>
+      </w:hyperlink>
+      <w:r>
+        <w:rPr>
+          <w:lang w:val="es-EC"/>
+        </w:rPr>
+        <w:t>.</w:t>
       </w:r>
     </w:p>
     <w:p>
       <w:pPr>
         <w:pStyle w:val="Listaconvietas"/>
+        <w:jc w:val="both"/>
         <w:rPr>
           <w:lang w:val="es-EC"/>
         </w:rPr>
@@ -1546,6 +2579,7 @@
     <w:p>
       <w:pPr>
         <w:pStyle w:val="Listaconvietas"/>
+        <w:jc w:val="both"/>
         <w:rPr>
           <w:lang w:val="es-EC"/>
         </w:rPr>
@@ -1560,6 +2594,7 @@
     <w:p>
       <w:pPr>
         <w:pStyle w:val="Listaconvietas"/>
+        <w:jc w:val="both"/>
       </w:pPr>
       <w:proofErr w:type="spellStart"/>
       <w:r>
@@ -1589,6 +2624,7 @@
     <w:p>
       <w:pPr>
         <w:pStyle w:val="Listaconvietas"/>
+        <w:jc w:val="both"/>
         <w:rPr>
           <w:lang w:val="es-EC"/>
         </w:rPr>
@@ -1603,6 +2639,7 @@
     <w:p>
       <w:pPr>
         <w:pStyle w:val="Ttulo1"/>
+        <w:jc w:val="both"/>
       </w:pPr>
       <w:r>
         <w:rPr>
@@ -1614,6 +2651,7 @@
     <w:p>
       <w:pPr>
         <w:pStyle w:val="Listaconvietas"/>
+        <w:jc w:val="both"/>
         <w:rPr>
           <w:lang w:val="es-EC"/>
         </w:rPr>
@@ -1622,50 +2660,85 @@
         <w:rPr>
           <w:lang w:val="es-EC"/>
         </w:rPr>
-        <w:t>Continuar agregando noticias y actividades con fechas en formato ISO (YYYY-MM-DD)</w:t>
+        <w:t xml:space="preserve">Continuar </w:t>
+      </w:r>
+      <w:r>
+        <w:rPr>
+          <w:rFonts w:ascii="Cambria" w:hAnsi="Cambria"/>
+          <w:lang w:val="es-EC"/>
+        </w:rPr>
+        <w:t>registrando las</w:t>
+      </w:r>
+      <w:r>
+        <w:rPr>
+          <w:lang w:val="es-EC"/>
+        </w:rPr>
+        <w:t xml:space="preserve"> noticias y actividades con </w:t>
+      </w:r>
+      <w:r>
+        <w:rPr>
+          <w:rFonts w:ascii="Cambria" w:hAnsi="Cambria"/>
+          <w:lang w:val="es-EC"/>
+        </w:rPr>
+        <w:t>su fecha para que se incorporen a los boletines</w:t>
       </w:r>
     </w:p>
     <w:p>
       <w:pPr>
         <w:pStyle w:val="Listaconvietas"/>
-      </w:pPr>
-      <w:proofErr w:type="spellStart"/>
+        <w:jc w:val="both"/>
+        <w:rPr>
+          <w:lang w:val="es-EC"/>
+        </w:rPr>
+      </w:pPr>
       <w:r>
+        <w:rPr>
+          <w:rFonts w:ascii="Cambria" w:hAnsi="Cambria"/>
+          <w:lang w:val="es-EC"/>
+        </w:rPr>
         <w:lastRenderedPageBreak/>
-        <w:t>Verificar</w:t>
+        <w:t xml:space="preserve">Revisar cada mes que la sección de </w:t>
       </w:r>
-      <w:proofErr w:type="spellEnd"/>
       <w:r>
-        <w:t xml:space="preserve"> </w:t>
+        <w:rPr>
+          <w:lang w:val="es-EC"/>
+        </w:rPr>
+        <w:t xml:space="preserve">boletines </w:t>
       </w:r>
-      <w:proofErr w:type="spellStart"/>
       <w:r>
-        <w:t>acceso</w:t>
+        <w:rPr>
+          <w:rFonts w:ascii="Cambria" w:hAnsi="Cambria"/>
+          <w:lang w:val="es-EC"/>
+        </w:rPr>
+        <w:t>siga disponibl</w:t>
       </w:r>
-      <w:proofErr w:type="spellEnd"/>
       <w:r>
-        <w:t xml:space="preserve"> a /</w:t>
-      </w:r>
-      <w:proofErr w:type="spellStart"/>
-      <w:r>
-        <w:t>boletines</w:t>
-      </w:r>
-      <w:proofErr w:type="spellEnd"/>
-      <w:r>
-        <w:t xml:space="preserve"> mensualmente</w:t>
+        <w:rPr>
+          <w:lang w:val="es-EC"/>
+        </w:rPr>
+        <w:t>e</w:t>
       </w:r>
     </w:p>
     <w:p>
       <w:pPr>
         <w:pStyle w:val="Listaconvietas"/>
+        <w:jc w:val="both"/>
+        <w:rPr>
+          <w:lang w:val="es-EC"/>
+        </w:rPr>
       </w:pPr>
       <w:r>
-        <w:t>Considerar automatizar envío de boletín por email cada bimestre (futuro)</w:t>
+        <w:rPr>
+          <w:rFonts w:ascii="Cambria" w:hAnsi="Cambria"/>
+          <w:lang w:val="es-EC"/>
+        </w:rPr>
+        <w:t>Estudiar a futuro el envío del boletín por correo electrónico al cierre de cada bimestre</w:t>
       </w:r>
     </w:p>
     <w:p>
       <w:pPr>
         <w:pStyle w:val="Listaconvietas"/>
+        <w:jc w:val="both"/>
         <w:rPr>
           <w:lang w:val="es-EC"/>
         </w:rPr>
@@ -1680,6 +2753,7 @@
     <w:p>
       <w:pPr>
         <w:pStyle w:val="Listaconvietas"/>
+        <w:jc w:val="both"/>
         <w:rPr>
           <w:lang w:val="es-EC"/>
         </w:rPr>
@@ -1693,32 +2767,56 @@
     </w:p>
     <w:p>
       <w:pPr>
-        <w:rPr>
-          <w:lang w:val="es-EC"/>
-        </w:rPr>
-      </w:pPr>
-      <w:r>
-        <w:rPr>
-          <w:lang w:val="es-EC"/>
-        </w:rPr>
-        <w:br w:type="page"/>
-      </w:r>
-    </w:p>
-    <w:p>
-      <w:pPr>
         <w:pStyle w:val="Ttulo1"/>
+        <w:jc w:val="both"/>
       </w:pPr>
       <w:r>
         <w:rPr>
           <w:color w:val="003366"/>
         </w:rPr>
-        <w:lastRenderedPageBreak/>
-        <w:t>8. Firmas y Aprobaciones</w:t>
+        <w:t xml:space="preserve">8. </w:t>
       </w:r>
+      <w:proofErr w:type="spellStart"/>
+      <w:r>
+        <w:rPr>
+          <w:color w:val="003366"/>
+        </w:rPr>
+        <w:t>Firma</w:t>
+      </w:r>
+      <w:proofErr w:type="spellEnd"/>
+      <w:r>
+        <w:rPr>
+          <w:color w:val="003366"/>
+        </w:rPr>
+        <w:t xml:space="preserve"> de </w:t>
+      </w:r>
+      <w:proofErr w:type="spellStart"/>
+      <w:r>
+        <w:rPr>
+          <w:color w:val="003366"/>
+        </w:rPr>
+        <w:t>Responsabilidad</w:t>
+      </w:r>
+      <w:proofErr w:type="spellEnd"/>
     </w:p>
-    <w:p/>
     <w:p>
       <w:pPr>
+        <w:jc w:val="both"/>
+      </w:pPr>
+    </w:p>
+    <w:p>
+      <w:pPr>
+        <w:jc w:val="both"/>
+      </w:pPr>
+    </w:p>
+    <w:p>
+      <w:pPr>
+        <w:jc w:val="both"/>
+      </w:pPr>
+    </w:p>
+    <w:p>
+      <w:pPr>
+        <w:jc w:val="both"/>
         <w:rPr>
           <w:lang w:val="es-EC"/>
         </w:rPr>
@@ -1784,12 +2882,12 @@
       </w:r>
     </w:p>
     <w:sectPr>
-      <w:headerReference w:type="even" r:id="rId8"/>
-      <w:headerReference w:type="default" r:id="rId9"/>
-      <w:footerReference w:type="even" r:id="rId10"/>
-      <w:footerReference w:type="default" r:id="rId11"/>
-      <w:headerReference w:type="first" r:id="rId12"/>
-      <w:footerReference w:type="first" r:id="rId13"/>
+      <w:headerReference w:type="even" r:id="rId10"/>
+      <w:headerReference w:type="default" r:id="rId11"/>
+      <w:footerReference w:type="even" r:id="rId12"/>
+      <w:footerReference w:type="default" r:id="rId13"/>
+      <w:headerReference w:type="first" r:id="rId14"/>
+      <w:footerReference w:type="first" r:id="rId15"/>
       <w:pgSz w:w="12240" w:h="15840"/>
       <w:pgMar w:top="1440" w:right="1800" w:bottom="1440" w:left="1800" w:header="720" w:footer="720" w:gutter="0"/>
       <w:cols w:space="720"/>
@@ -2745,7 +3843,6 @@
   <w:style w:type="character" w:default="1" w:styleId="Fuentedeprrafopredeter">
     <w:name w:val="Default Paragraph Font"/>
     <w:uiPriority w:val="1"/>
-    <w:semiHidden/>
     <w:unhideWhenUsed/>
   </w:style>
   <w:style w:type="table" w:default="1" w:styleId="Tablanormal">

</xml_diff>